<commit_message>
CAR Varones mobiliario: credenzas M44 del dormitorio de E-07 contadas por su etiqueta en planta
Co-Authored-By: Claude Opus 5.5 <noreply@anthropic.com>
Claude-Session: https://claude.ai/code/session_0142t8T16igb3VKxUPwnQPq6
</commit_message>
<xml_diff>
--- a/entregables_varones/MEMORIA_DESCRIPTIVA_EQUIPAMIENTO_Y_MOBILIARIO_CAR_VARONES.docx
+++ b/entregables_varones/MEMORIA_DESCRIPTIVA_EQUIPAMIENTO_Y_MOBILIARIO_CAR_VARONES.docx
@@ -6221,6 +6221,91 @@
                 <w:i w:val="0"/>
                 <w:sz w:val="16"/>
               </w:rPr>
+              <w:t>Secretaria/sala de espera</w:t>
+            </w:r>
+          </w:p>
+        </w:tc>
+        <w:tc>
+          <w:tcPr>
+            <w:tcW w:type="dxa" w:w="737"/>
+            <w:vAlign w:val="center"/>
+          </w:tcPr>
+          <w:p>
+            <w:pPr>
+              <w:spacing w:after="20" w:before="20"/>
+              <w:jc w:val="center"/>
+            </w:pPr>
+            <w:r>
+              <w:rPr>
+                <w:b w:val="0"/>
+                <w:i w:val="0"/>
+                <w:sz w:val="16"/>
+              </w:rPr>
+              <w:t>M62</w:t>
+            </w:r>
+          </w:p>
+        </w:tc>
+        <w:tc>
+          <w:tcPr>
+            <w:tcW w:type="dxa" w:w="5499"/>
+            <w:vAlign w:val="center"/>
+          </w:tcPr>
+          <w:p>
+            <w:pPr>
+              <w:spacing w:after="20" w:before="20"/>
+              <w:jc w:val="left"/>
+            </w:pPr>
+            <w:r>
+              <w:rPr>
+                <w:b w:val="0"/>
+                <w:i w:val="0"/>
+                <w:sz w:val="16"/>
+              </w:rPr>
+              <w:t>M62</w:t>
+            </w:r>
+          </w:p>
+        </w:tc>
+        <w:tc>
+          <w:tcPr>
+            <w:tcW w:type="dxa" w:w="794"/>
+            <w:vAlign w:val="center"/>
+          </w:tcPr>
+          <w:p>
+            <w:pPr>
+              <w:spacing w:after="20" w:before="20"/>
+              <w:jc w:val="center"/>
+            </w:pPr>
+            <w:r>
+              <w:rPr>
+                <w:b w:val="0"/>
+                <w:i w:val="0"/>
+                <w:sz w:val="16"/>
+              </w:rPr>
+              <w:t>1</w:t>
+            </w:r>
+          </w:p>
+        </w:tc>
+      </w:tr>
+      <w:tr>
+        <w:trPr>
+          <w:cantSplit/>
+        </w:trPr>
+        <w:tc>
+          <w:tcPr>
+            <w:tcW w:type="dxa" w:w="2041"/>
+            <w:vAlign w:val="center"/>
+          </w:tcPr>
+          <w:p>
+            <w:pPr>
+              <w:spacing w:after="20" w:before="20"/>
+              <w:jc w:val="left"/>
+            </w:pPr>
+            <w:r>
+              <w:rPr>
+                <w:b w:val="0"/>
+                <w:i w:val="0"/>
+                <w:sz w:val="16"/>
+              </w:rPr>
               <w:t>Ss.hh. varones y ss.hh. mujeres</w:t>
             </w:r>
           </w:p>
@@ -19327,7 +19412,7 @@
           <w:i w:val="0"/>
           <w:sz w:val="22"/>
         </w:rPr>
-        <w:t>Vivienda de niños de 6 a 11 años: oficina de entrevista y estar, taller de arte con mesas y sillas regulables, proyector interactivo y pizarra, dormitorio de la madre, dormitorios, servicios higiénicos y lavandería.</w:t>
+        <w:t>Vivienda de niños de 6 a 11 años: oficina de entrevista y estar, taller de arte con mesas y sillas regulables, proyector interactivo y pizarra, dormitorio de la madre, dormitorios con camas y credenzas, servicios higiénicos y lavandería.</w:t>
       </w:r>
     </w:p>
     <w:p>
@@ -19492,7 +19577,7 @@
                 <w:i w:val="0"/>
                 <w:sz w:val="16"/>
               </w:rPr>
-              <w:t>M37</w:t>
+              <w:t>M55</w:t>
             </w:r>
           </w:p>
         </w:tc>
@@ -19512,7 +19597,7 @@
                 <w:i w:val="0"/>
                 <w:sz w:val="16"/>
               </w:rPr>
-              <w:t>Armario para almacenar material de melamina con 2 puertas y 5 divisiones 0.90 x 0.60 x 1.80 m.</w:t>
+              <w:t>Cama con cabecera de 0.90 x 1.90 m</w:t>
             </w:r>
           </w:p>
         </w:tc>
@@ -19577,7 +19662,7 @@
                 <w:i w:val="0"/>
                 <w:sz w:val="16"/>
               </w:rPr>
-              <w:t>M55</w:t>
+              <w:t>M44</w:t>
             </w:r>
           </w:p>
         </w:tc>
@@ -19597,7 +19682,7 @@
                 <w:i w:val="0"/>
                 <w:sz w:val="16"/>
               </w:rPr>
-              <w:t>Cama con cabecera de 0.90 x 1.90 m</w:t>
+              <w:t>Credenza de melamina con dos puertas, dos divisiones y tres gavetas 0.75 x 0.40 x 1.20 m</w:t>
             </w:r>
           </w:p>
         </w:tc>
@@ -29712,7 +29797,7 @@
                 <w:i w:val="0"/>
                 <w:sz w:val="17"/>
               </w:rPr>
-              <w:t>45</w:t>
+              <w:t>35</w:t>
             </w:r>
           </w:p>
         </w:tc>
@@ -29843,6 +29928,71 @@
                 <w:sz w:val="17"/>
               </w:rPr>
               <w:t>4</w:t>
+            </w:r>
+          </w:p>
+        </w:tc>
+      </w:tr>
+      <w:tr>
+        <w:trPr>
+          <w:cantSplit/>
+        </w:trPr>
+        <w:tc>
+          <w:tcPr>
+            <w:tcW w:type="dxa" w:w="794"/>
+            <w:vAlign w:val="center"/>
+          </w:tcPr>
+          <w:p>
+            <w:pPr>
+              <w:spacing w:after="20" w:before="20"/>
+              <w:jc w:val="center"/>
+            </w:pPr>
+            <w:r>
+              <w:rPr>
+                <w:b w:val="0"/>
+                <w:i w:val="0"/>
+                <w:sz w:val="17"/>
+              </w:rPr>
+              <w:t>M44</w:t>
+            </w:r>
+          </w:p>
+        </w:tc>
+        <w:tc>
+          <w:tcPr>
+            <w:tcW w:type="dxa" w:w="7370"/>
+            <w:vAlign w:val="center"/>
+          </w:tcPr>
+          <w:p>
+            <w:pPr>
+              <w:spacing w:after="20" w:before="20"/>
+              <w:jc w:val="left"/>
+            </w:pPr>
+            <w:r>
+              <w:rPr>
+                <w:b w:val="0"/>
+                <w:i w:val="0"/>
+                <w:sz w:val="17"/>
+              </w:rPr>
+              <w:t>Credenza de melamina con dos puertas, dos divisiones y tres gavetas 0.75 x 0.40 x 1.20 m</w:t>
+            </w:r>
+          </w:p>
+        </w:tc>
+        <w:tc>
+          <w:tcPr>
+            <w:tcW w:type="dxa" w:w="907"/>
+            <w:vAlign w:val="center"/>
+          </w:tcPr>
+          <w:p>
+            <w:pPr>
+              <w:spacing w:after="20" w:before="20"/>
+              <w:jc w:val="center"/>
+            </w:pPr>
+            <w:r>
+              <w:rPr>
+                <w:b w:val="0"/>
+                <w:i w:val="0"/>
+                <w:sz w:val="17"/>
+              </w:rPr>
+              <w:t>10</w:t>
             </w:r>
           </w:p>
         </w:tc>
@@ -31328,7 +31478,7 @@
                 <w:i w:val="0"/>
                 <w:sz w:val="17"/>
               </w:rPr>
-              <w:t>21</w:t>
+              <w:t>22</w:t>
             </w:r>
           </w:p>
         </w:tc>
@@ -34093,7 +34243,7 @@
                 <w:i w:val="0"/>
                 <w:sz w:val="18"/>
               </w:rPr>
-              <w:t>43</w:t>
+              <w:t>44</w:t>
             </w:r>
           </w:p>
         </w:tc>
@@ -34113,7 +34263,7 @@
                 <w:i w:val="0"/>
                 <w:sz w:val="18"/>
               </w:rPr>
-              <w:t>583</w:t>
+              <w:t>584</w:t>
             </w:r>
           </w:p>
         </w:tc>
@@ -34225,7 +34375,7 @@
                 <w:i w:val="0"/>
                 <w:sz w:val="18"/>
               </w:rPr>
-              <w:t>92</w:t>
+              <w:t>93</w:t>
             </w:r>
           </w:p>
         </w:tc>
@@ -34246,7 +34396,7 @@
                 <w:i w:val="0"/>
                 <w:sz w:val="18"/>
               </w:rPr>
-              <w:t>905</w:t>
+              <w:t>906</w:t>
             </w:r>
           </w:p>
         </w:tc>

</xml_diff>